<commit_message>
ELEC study: add forward-Ke row to the discount-schedule table (§1.8)
Co-Authored-By: Claude Fable 5 <noreply@anthropic.com>
Claude-Session: https://claude.ai/code/session_01WDB3U7m8U6NX4ju3RCn348
</commit_message>
<xml_diff>
--- a/engine/elec_study/ELEC_Valuation_Study_05-08-2026_public.docx
+++ b/engine/elec_study/ELEC_Valuation_Study_05-08-2026_public.docx
@@ -9214,7 +9214,7 @@
                 <w:color w:val="1C3A36"/>
                 <w:sz w:val="17"/>
               </w:rPr>
-              <w:t>Forward Kd path</w:t>
+              <w:t>Forward Kd path (pre-tax)</w:t>
             </w:r>
           </w:p>
         </w:tc>
@@ -9305,6 +9305,116 @@
                 <w:sz w:val="17"/>
               </w:rPr>
               <w:t>15.5%</w:t>
+            </w:r>
+          </w:p>
+        </w:tc>
+      </w:tr>
+      <w:tr>
+        <w:tc>
+          <w:tcPr>
+            <w:tcW w:type="dxa" w:w="3024"/>
+          </w:tcPr>
+          <w:p>
+            <w:pPr>
+              <w:spacing w:after="20"/>
+            </w:pPr>
+            <w:r>
+              <w:rPr>
+                <w:b/>
+                <w:color w:val="1C3A36"/>
+                <w:sz w:val="17"/>
+              </w:rPr>
+              <w:t>Forward Ke (same easing calendar)</w:t>
+            </w:r>
+          </w:p>
+        </w:tc>
+        <w:tc>
+          <w:tcPr>
+            <w:tcW w:type="dxa" w:w="1440"/>
+          </w:tcPr>
+          <w:p>
+            <w:pPr>
+              <w:spacing w:after="20"/>
+              <w:jc w:val="right"/>
+            </w:pPr>
+            <w:r>
+              <w:rPr>
+                <w:color w:val="1C3A36"/>
+                <w:sz w:val="17"/>
+              </w:rPr>
+              <w:t>28.0%</w:t>
+            </w:r>
+          </w:p>
+        </w:tc>
+        <w:tc>
+          <w:tcPr>
+            <w:tcW w:type="dxa" w:w="1440"/>
+          </w:tcPr>
+          <w:p>
+            <w:pPr>
+              <w:spacing w:after="20"/>
+              <w:jc w:val="right"/>
+            </w:pPr>
+            <w:r>
+              <w:rPr>
+                <w:color w:val="1C3A36"/>
+                <w:sz w:val="17"/>
+              </w:rPr>
+              <w:t>24.7%</w:t>
+            </w:r>
+          </w:p>
+        </w:tc>
+        <w:tc>
+          <w:tcPr>
+            <w:tcW w:type="dxa" w:w="1440"/>
+          </w:tcPr>
+          <w:p>
+            <w:pPr>
+              <w:spacing w:after="20"/>
+              <w:jc w:val="right"/>
+            </w:pPr>
+            <w:r>
+              <w:rPr>
+                <w:color w:val="1C3A36"/>
+                <w:sz w:val="17"/>
+              </w:rPr>
+              <w:t>22.2%</w:t>
+            </w:r>
+          </w:p>
+        </w:tc>
+        <w:tc>
+          <w:tcPr>
+            <w:tcW w:type="dxa" w:w="1440"/>
+          </w:tcPr>
+          <w:p>
+            <w:pPr>
+              <w:spacing w:after="20"/>
+              <w:jc w:val="right"/>
+            </w:pPr>
+            <w:r>
+              <w:rPr>
+                <w:color w:val="1C3A36"/>
+                <w:sz w:val="17"/>
+              </w:rPr>
+              <w:t>19.4%</w:t>
+            </w:r>
+          </w:p>
+        </w:tc>
+        <w:tc>
+          <w:tcPr>
+            <w:tcW w:type="dxa" w:w="1440"/>
+          </w:tcPr>
+          <w:p>
+            <w:pPr>
+              <w:spacing w:after="20"/>
+              <w:jc w:val="right"/>
+            </w:pPr>
+            <w:r>
+              <w:rPr>
+                <w:color w:val="1C3A36"/>
+                <w:sz w:val="17"/>
+              </w:rPr>
+              <w:t>17.2%</w:t>
             </w:r>
           </w:p>
         </w:tc>

</xml_diff>